<commit_message>
Update: Implement new config system; optimize table-mode output format; fix encoding to GBK
</commit_message>
<xml_diff>
--- a/SampleForTest/CC_Sample_1.docx
+++ b/SampleForTest/CC_Sample_1.docx
@@ -62,7 +62,7 @@
           <w:rPr>
             <w:rFonts w:hint="eastAsia"/>
           </w:rPr>
-          <w:alias w:val="部门"/>
+          <w:alias w:val="hahaha "/>
           <w:id w:val="-559633323"/>
           <w:placeholder>
             <w:docPart w:val="DefaultPlaceholder_-1854013438"/>
@@ -82,132 +82,10 @@
         </w:sdtContent>
       </w:sdt>
     </w:p>
-    <w:p/>
-    <w:p/>
-    <w:tbl>
-      <w:tblPr>
-        <w:tblStyle w:val="af"/>
-        <w:tblW w:w="0" w:type="auto"/>
-        <w:tblLook w:val="04A0" w:firstRow="1" w:lastRow="0" w:firstColumn="1" w:lastColumn="0" w:noHBand="0" w:noVBand="1"/>
-      </w:tblPr>
-      <w:tblGrid>
-        <w:gridCol w:w="8296"/>
-      </w:tblGrid>
-      <w:tr>
-        <w:tc>
-          <w:tcPr>
-            <w:tcW w:w="8296" w:type="dxa"/>
-          </w:tcPr>
-          <w:tbl>
-            <w:tblPr>
-              <w:tblStyle w:val="af"/>
-              <w:tblW w:w="0" w:type="auto"/>
-              <w:tblLook w:val="04A0" w:firstRow="1" w:lastRow="0" w:firstColumn="1" w:lastColumn="0" w:noHBand="0" w:noVBand="1"/>
-            </w:tblPr>
-            <w:tblGrid>
-              <w:gridCol w:w="4035"/>
-              <w:gridCol w:w="4035"/>
-            </w:tblGrid>
-            <w:tr>
-              <w:tc>
-                <w:tcPr>
-                  <w:tcW w:w="4035" w:type="dxa"/>
-                </w:tcPr>
-                <w:p/>
-              </w:tc>
-              <w:tc>
-                <w:tcPr>
-                  <w:tcW w:w="4035" w:type="dxa"/>
-                </w:tcPr>
-                <w:p/>
-              </w:tc>
-            </w:tr>
-            <w:tr>
-              <w:tc>
-                <w:tcPr>
-                  <w:tcW w:w="4035" w:type="dxa"/>
-                </w:tcPr>
-                <w:p/>
-              </w:tc>
-              <w:tc>
-                <w:tcPr>
-                  <w:tcW w:w="4035" w:type="dxa"/>
-                </w:tcPr>
-                <w:p/>
-              </w:tc>
-            </w:tr>
-          </w:tbl>
-          <w:p/>
-        </w:tc>
-      </w:tr>
-    </w:tbl>
-    <w:p/>
     <w:sdt>
       <w:sdtPr>
-        <w:id w:val="-1481533120"/>
-        <w:placeholder>
-          <w:docPart w:val="DefaultPlaceholder_-1854013440"/>
-        </w:placeholder>
-      </w:sdtPr>
-      <w:sdtContent>
-        <w:p>
-          <w:r>
-            <w:fldChar w:fldCharType="begin">
-              <w:ffData>
-                <w:name w:val="文字1"/>
-                <w:enabled/>
-                <w:calcOnExit w:val="0"/>
-                <w:textInput/>
-              </w:ffData>
-            </w:fldChar>
-          </w:r>
-          <w:bookmarkStart w:id="0" w:name="文字1"/>
-          <w:r>
-            <w:instrText xml:space="preserve"> FORMTEXT </w:instrText>
-          </w:r>
-          <w:r>
-            <w:fldChar w:fldCharType="separate"/>
-          </w:r>
-          <w:r>
-            <w:rPr>
-              <w:rFonts w:hint="eastAsia"/>
-              <w:noProof/>
-            </w:rPr>
-            <w:t>123</w:t>
-          </w:r>
-          <w:r>
-            <w:fldChar w:fldCharType="end"/>
-          </w:r>
-        </w:p>
-        <w:bookmarkEnd w:id="0" w:displacedByCustomXml="next"/>
-      </w:sdtContent>
-    </w:sdt>
-    <w:sdt>
-      <w:sdtPr>
-        <w:rPr>
-          <w:rFonts w:hint="eastAsia"/>
-        </w:rPr>
-        <w:id w:val="1829250892"/>
-        <w:placeholder>
-          <w:docPart w:val="DefaultPlaceholder_-1854013440"/>
-        </w:placeholder>
-        <w:showingPlcHdr/>
-      </w:sdtPr>
-      <w:sdtContent>
-        <w:p>
-          <w:r>
-            <w:rPr>
-              <w:rStyle w:val="ae"/>
-              <w:rFonts w:hint="eastAsia"/>
-            </w:rPr>
-            <w:t>单击或点击此处输入文字。</w:t>
-          </w:r>
-        </w:p>
-      </w:sdtContent>
-    </w:sdt>
-    <w:p/>
-    <w:sdt>
-      <w:sdtPr>
+        <w:alias w:val="ces"/>
+        <w:tag w:val="ces"/>
         <w:id w:val="180559251"/>
         <w:placeholder>
           <w:docPart w:val="DefaultPlaceholder_-1854013440"/>
@@ -313,102 +191,102 @@
         <w:p/>
       </w:sdtContent>
     </w:sdt>
+    <w:sdt>
+      <w:sdtPr>
+        <w:alias w:val="323"/>
+        <w:tag w:val="ces11"/>
+        <w:id w:val="178241561"/>
+        <w:placeholder>
+          <w:docPart w:val="DefaultPlaceholder_-1854013440"/>
+        </w:placeholder>
+      </w:sdtPr>
+      <w:sdtContent>
+        <w:p>
+          <w:r>
+            <w:t>K</w:t>
+          </w:r>
+          <w:r>
+            <w:rPr>
+              <w:rFonts w:hint="eastAsia"/>
+            </w:rPr>
+            <w:t>onga</w:t>
+          </w:r>
+          <w:r>
+            <w:rPr>
+              <w:rFonts w:hint="eastAsia"/>
+            </w:rPr>
+            <w:t>132</w:t>
+          </w:r>
+        </w:p>
+        <w:p>
+          <w:sdt>
+            <w:sdtPr>
+              <w:rPr>
+                <w:rFonts w:hint="eastAsia"/>
+              </w:rPr>
+              <w:alias w:val="姓名"/>
+              <w:tag w:val="UserName"/>
+              <w:id w:val="-35045161"/>
+              <w:placeholder>
+                <w:docPart w:val="9AEF252382AB4116A2AA9BD2A09AE6A0"/>
+              </w:placeholder>
+              <w:text/>
+            </w:sdtPr>
+            <w:sdtContent>
+              <w:r>
+                <w:rPr>
+                  <w:rFonts w:hint="eastAsia"/>
+                </w:rPr>
+                <w:t>新式员工</w:t>
+              </w:r>
+              <w:r>
+                <w:rPr>
+                  <w:rFonts w:hint="eastAsia"/>
+                </w:rPr>
+                <w:t>_1231</w:t>
+              </w:r>
+            </w:sdtContent>
+          </w:sdt>
+        </w:p>
+      </w:sdtContent>
+    </w:sdt>
     <w:p/>
-    <w:p/>
-    <w:p>
-      <w:pPr>
+    <w:sdt>
+      <w:sdtPr>
         <w:rPr>
           <w:rFonts w:hint="eastAsia"/>
         </w:rPr>
-      </w:pPr>
-      <w:r>
-        <w:fldChar w:fldCharType="begin">
-          <w:ffData>
-            <w:name w:val="文字3"/>
-            <w:enabled/>
-            <w:calcOnExit w:val="0"/>
-            <w:textInput/>
-          </w:ffData>
-        </w:fldChar>
-      </w:r>
-      <w:bookmarkStart w:id="1" w:name="文字3"/>
-      <w:r>
-        <w:instrText xml:space="preserve"> FORMTEXT </w:instrText>
-      </w:r>
-      <w:r>
-        <w:fldChar w:fldCharType="separate"/>
-      </w:r>
-      <w:r>
-        <w:rPr>
-          <w:noProof/>
-        </w:rPr>
-        <w:t> </w:t>
-      </w:r>
-      <w:r>
-        <w:rPr>
-          <w:noProof/>
-        </w:rPr>
-        <w:t> </w:t>
-      </w:r>
-      <w:r>
-        <w:rPr>
-          <w:noProof/>
-        </w:rPr>
-        <w:t> </w:t>
-      </w:r>
-      <w:r>
-        <w:rPr>
-          <w:noProof/>
-        </w:rPr>
-        <w:t> </w:t>
-      </w:r>
-      <w:r>
-        <w:rPr>
-          <w:noProof/>
-        </w:rPr>
-        <w:t> </w:t>
-      </w:r>
-      <w:r>
-        <w:fldChar w:fldCharType="end"/>
-      </w:r>
-      <w:bookmarkEnd w:id="1"/>
-    </w:p>
-    <w:p/>
-    <w:p>
-      <w:pPr>
-        <w:rPr>
-          <w:rFonts w:hint="eastAsia"/>
-        </w:rPr>
-      </w:pPr>
-      <w:r>
-        <w:fldChar w:fldCharType="begin">
-          <w:ffData>
-            <w:name w:val="文字2"/>
-            <w:enabled/>
-            <w:calcOnExit w:val="0"/>
-            <w:textInput/>
-          </w:ffData>
-        </w:fldChar>
-      </w:r>
-      <w:bookmarkStart w:id="2" w:name="文字2"/>
-      <w:r>
-        <w:instrText xml:space="preserve"> FORMTEXT </w:instrText>
-      </w:r>
-      <w:r>
-        <w:fldChar w:fldCharType="separate"/>
-      </w:r>
-      <w:r>
-        <w:rPr>
-          <w:rFonts w:hint="eastAsia"/>
-          <w:noProof/>
-        </w:rPr>
-        <w:t>123</w:t>
-      </w:r>
-      <w:r>
-        <w:fldChar w:fldCharType="end"/>
-      </w:r>
-      <w:bookmarkEnd w:id="2"/>
-    </w:p>
+        <w:id w:val="-567185683"/>
+        <w:placeholder>
+          <w:docPart w:val="DefaultPlaceholder_-1854013440"/>
+        </w:placeholder>
+        <w:text/>
+      </w:sdtPr>
+      <w:sdtContent>
+        <w:p>
+          <w:r>
+            <w:rPr>
+              <w:rFonts w:hint="eastAsia"/>
+            </w:rPr>
+            <w:t>222b=</w:t>
+          </w:r>
+          <w:proofErr w:type="spellStart"/>
+          <w:r>
+            <w:rPr>
+              <w:rFonts w:hint="eastAsia"/>
+            </w:rPr>
+            <w:t>kng</w:t>
+          </w:r>
+          <w:proofErr w:type="spellEnd"/>
+          <w:r>
+            <w:rPr>
+              <w:rFonts w:hint="eastAsia"/>
+            </w:rPr>
+            <w:t xml:space="preserve"> 2</w:t>
+          </w:r>
+        </w:p>
+      </w:sdtContent>
+    </w:sdt>
     <w:sectPr>
       <w:pgSz w:w="11906" w:h="16838"/>
       <w:pgMar w:top="1440" w:right="1800" w:bottom="1440" w:left="1800" w:header="851" w:footer="992" w:gutter="0"/>
@@ -417,6 +295,44 @@
     </w:sectPr>
   </w:body>
 </w:document>
+</file>
+
+<file path=word/endnotes.xml><?xml version="1.0" encoding="utf-8"?>
+<w:endnotes xmlns:wpc="http://schemas.microsoft.com/office/word/2010/wordprocessingCanvas" xmlns:cx="http://schemas.microsoft.com/office/drawing/2014/chartex" xmlns:cx1="http://schemas.microsoft.com/office/drawing/2015/9/8/chartex" xmlns:cx2="http://schemas.microsoft.com/office/drawing/2015/10/21/chartex" xmlns:cx3="http://schemas.microsoft.com/office/drawing/2016/5/9/chartex" xmlns:cx4="http://schemas.microsoft.com/office/drawing/2016/5/10/chartex" xmlns:cx5="http://schemas.microsoft.com/office/drawing/2016/5/11/chartex" xmlns:cx6="http://schemas.microsoft.com/office/drawing/2016/5/12/chartex" xmlns:cx7="http://schemas.microsoft.com/office/drawing/2016/5/13/chartex" xmlns:cx8="http://schemas.microsoft.com/office/drawing/2016/5/14/chartex" xmlns:mc="http://schemas.openxmlformats.org/markup-compatibility/2006" xmlns:aink="http://schemas.microsoft.com/office/drawing/2016/ink" xmlns:am3d="http://schemas.microsoft.com/office/drawing/2017/model3d" xmlns:o="urn:schemas-microsoft-com:office:office" xmlns:oel="http://schemas.microsoft.com/office/2019/extlst" xmlns:r="http://schemas.openxmlformats.org/officeDocument/2006/relationships" xmlns:m="http://schemas.openxmlformats.org/officeDocument/2006/math" xmlns:v="urn:schemas-microsoft-com:vml" xmlns:wp14="http://schemas.microsoft.com/office/word/2010/wordprocessingDrawing" xmlns:wp="http://schemas.openxmlformats.org/drawingml/2006/wordprocessingDrawing" xmlns:w10="urn:schemas-microsoft-com:office:word" xmlns:w="http://schemas.openxmlformats.org/wordprocessingml/2006/main" xmlns:w14="http://schemas.microsoft.com/office/word/2010/wordml" xmlns:w15="http://schemas.microsoft.com/office/word/2012/wordml" xmlns:w16cex="http://schemas.microsoft.com/office/word/2018/wordml/cex" xmlns:w16cid="http://schemas.microsoft.com/office/word/2016/wordml/cid" xmlns:w16="http://schemas.microsoft.com/office/word/2018/wordml" xmlns:w16du="http://schemas.microsoft.com/office/word/2023/wordml/word16du" xmlns:w16sdtdh="http://schemas.microsoft.com/office/word/2020/wordml/sdtdatahash" xmlns:w16sdtfl="http://schemas.microsoft.com/office/word/2024/wordml/sdtformatlock" xmlns:w16se="http://schemas.microsoft.com/office/word/2015/wordml/symex" xmlns:wpg="http://schemas.microsoft.com/office/word/2010/wordprocessingGroup" xmlns:wpi="http://schemas.microsoft.com/office/word/2010/wordprocessingInk" xmlns:wne="http://schemas.microsoft.com/office/word/2006/wordml" xmlns:wps="http://schemas.microsoft.com/office/word/2010/wordprocessingShape" mc:Ignorable="w14 w15 w16se w16cid w16 w16cex w16sdtdh w16sdtfl w16du wp14">
+  <w:endnote w:type="separator" w:id="-1">
+    <w:p>
+      <w:r>
+        <w:separator/>
+      </w:r>
+    </w:p>
+  </w:endnote>
+  <w:endnote w:type="continuationSeparator" w:id="0">
+    <w:p>
+      <w:r>
+        <w:continuationSeparator/>
+      </w:r>
+    </w:p>
+  </w:endnote>
+</w:endnotes>
+</file>
+
+<file path=word/footnotes.xml><?xml version="1.0" encoding="utf-8"?>
+<w:footnotes xmlns:wpc="http://schemas.microsoft.com/office/word/2010/wordprocessingCanvas" xmlns:cx="http://schemas.microsoft.com/office/drawing/2014/chartex" xmlns:cx1="http://schemas.microsoft.com/office/drawing/2015/9/8/chartex" xmlns:cx2="http://schemas.microsoft.com/office/drawing/2015/10/21/chartex" xmlns:cx3="http://schemas.microsoft.com/office/drawing/2016/5/9/chartex" xmlns:cx4="http://schemas.microsoft.com/office/drawing/2016/5/10/chartex" xmlns:cx5="http://schemas.microsoft.com/office/drawing/2016/5/11/chartex" xmlns:cx6="http://schemas.microsoft.com/office/drawing/2016/5/12/chartex" xmlns:cx7="http://schemas.microsoft.com/office/drawing/2016/5/13/chartex" xmlns:cx8="http://schemas.microsoft.com/office/drawing/2016/5/14/chartex" xmlns:mc="http://schemas.openxmlformats.org/markup-compatibility/2006" xmlns:aink="http://schemas.microsoft.com/office/drawing/2016/ink" xmlns:am3d="http://schemas.microsoft.com/office/drawing/2017/model3d" xmlns:o="urn:schemas-microsoft-com:office:office" xmlns:oel="http://schemas.microsoft.com/office/2019/extlst" xmlns:r="http://schemas.openxmlformats.org/officeDocument/2006/relationships" xmlns:m="http://schemas.openxmlformats.org/officeDocument/2006/math" xmlns:v="urn:schemas-microsoft-com:vml" xmlns:wp14="http://schemas.microsoft.com/office/word/2010/wordprocessingDrawing" xmlns:wp="http://schemas.openxmlformats.org/drawingml/2006/wordprocessingDrawing" xmlns:w10="urn:schemas-microsoft-com:office:word" xmlns:w="http://schemas.openxmlformats.org/wordprocessingml/2006/main" xmlns:w14="http://schemas.microsoft.com/office/word/2010/wordml" xmlns:w15="http://schemas.microsoft.com/office/word/2012/wordml" xmlns:w16cex="http://schemas.microsoft.com/office/word/2018/wordml/cex" xmlns:w16cid="http://schemas.microsoft.com/office/word/2016/wordml/cid" xmlns:w16="http://schemas.microsoft.com/office/word/2018/wordml" xmlns:w16du="http://schemas.microsoft.com/office/word/2023/wordml/word16du" xmlns:w16sdtdh="http://schemas.microsoft.com/office/word/2020/wordml/sdtdatahash" xmlns:w16sdtfl="http://schemas.microsoft.com/office/word/2024/wordml/sdtformatlock" xmlns:w16se="http://schemas.microsoft.com/office/word/2015/wordml/symex" xmlns:wpg="http://schemas.microsoft.com/office/word/2010/wordprocessingGroup" xmlns:wpi="http://schemas.microsoft.com/office/word/2010/wordprocessingInk" xmlns:wne="http://schemas.microsoft.com/office/word/2006/wordml" xmlns:wps="http://schemas.microsoft.com/office/word/2010/wordprocessingShape" mc:Ignorable="w14 w15 w16se w16cid w16 w16cex w16sdtdh w16sdtfl w16du wp14">
+  <w:footnote w:type="separator" w:id="-1">
+    <w:p>
+      <w:r>
+        <w:separator/>
+      </w:r>
+    </w:p>
+  </w:footnote>
+  <w:footnote w:type="continuationSeparator" w:id="0">
+    <w:p>
+      <w:r>
+        <w:continuationSeparator/>
+      </w:r>
+    </w:p>
+  </w:footnote>
+</w:footnotes>
 </file>
 
 <file path=word/styles.xml><?xml version="1.0" encoding="utf-8"?>
@@ -1366,6 +1282,68 @@
       </w:tblBorders>
     </w:tblPr>
   </w:style>
+  <w:style w:type="paragraph" w:styleId="af0">
+    <w:name w:val="header"/>
+    <w:basedOn w:val="a"/>
+    <w:link w:val="af1"/>
+    <w:uiPriority w:val="99"/>
+    <w:unhideWhenUsed/>
+    <w:rsid w:val="00B92958"/>
+    <w:pPr>
+      <w:tabs>
+        <w:tab w:val="center" w:pos="4153"/>
+        <w:tab w:val="right" w:pos="8306"/>
+      </w:tabs>
+      <w:snapToGrid w:val="0"/>
+      <w:jc w:val="center"/>
+    </w:pPr>
+    <w:rPr>
+      <w:sz w:val="18"/>
+      <w:szCs w:val="18"/>
+    </w:rPr>
+  </w:style>
+  <w:style w:type="character" w:customStyle="1" w:styleId="af1">
+    <w:name w:val="页眉 字符"/>
+    <w:basedOn w:val="a0"/>
+    <w:link w:val="af0"/>
+    <w:uiPriority w:val="99"/>
+    <w:rsid w:val="00B92958"/>
+    <w:rPr>
+      <w:sz w:val="18"/>
+      <w:szCs w:val="18"/>
+    </w:rPr>
+  </w:style>
+  <w:style w:type="paragraph" w:styleId="af2">
+    <w:name w:val="footer"/>
+    <w:basedOn w:val="a"/>
+    <w:link w:val="af3"/>
+    <w:uiPriority w:val="99"/>
+    <w:unhideWhenUsed/>
+    <w:rsid w:val="00B92958"/>
+    <w:pPr>
+      <w:tabs>
+        <w:tab w:val="center" w:pos="4153"/>
+        <w:tab w:val="right" w:pos="8306"/>
+      </w:tabs>
+      <w:snapToGrid w:val="0"/>
+      <w:jc w:val="left"/>
+    </w:pPr>
+    <w:rPr>
+      <w:sz w:val="18"/>
+      <w:szCs w:val="18"/>
+    </w:rPr>
+  </w:style>
+  <w:style w:type="character" w:customStyle="1" w:styleId="af3">
+    <w:name w:val="页脚 字符"/>
+    <w:basedOn w:val="a0"/>
+    <w:link w:val="af2"/>
+    <w:uiPriority w:val="99"/>
+    <w:rsid w:val="00B92958"/>
+    <w:rPr>
+      <w:sz w:val="18"/>
+      <w:szCs w:val="18"/>
+    </w:rPr>
+  </w:style>
 </w:styles>
 </file>
 
@@ -1432,6 +1410,39 @@
               <w:rFonts w:hint="eastAsia"/>
             </w:rPr>
             <w:t>选择一项。</w:t>
+          </w:r>
+        </w:p>
+      </w:docPartBody>
+    </w:docPart>
+    <w:docPart>
+      <w:docPartPr>
+        <w:name w:val="9AEF252382AB4116A2AA9BD2A09AE6A0"/>
+        <w:category>
+          <w:name w:val="常规"/>
+          <w:gallery w:val="placeholder"/>
+        </w:category>
+        <w:types>
+          <w:type w:val="bbPlcHdr"/>
+        </w:types>
+        <w:behaviors>
+          <w:behavior w:val="content"/>
+        </w:behaviors>
+        <w:guid w:val="{F3094D36-48E7-45C4-B2B3-3164507D0826}"/>
+      </w:docPartPr>
+      <w:docPartBody>
+        <w:p>
+          <w:pPr>
+            <w:pStyle w:val="9AEF252382AB4116A2AA9BD2A09AE6A0"/>
+            <w:rPr>
+              <w:rFonts w:hint="eastAsia"/>
+            </w:rPr>
+          </w:pPr>
+          <w:r>
+            <w:rPr>
+              <w:rStyle w:val="a3"/>
+              <w:rFonts w:hint="eastAsia"/>
+            </w:rPr>
+            <w:t>单击或点击此处输入文字。</w:t>
           </w:r>
         </w:p>
       </w:docPartBody>
@@ -1516,10 +1527,25 @@
   </w:compat>
   <w:rsids>
     <w:rsidRoot w:val="0085066C"/>
+    <w:rsid w:val="000774B8"/>
+    <w:rsid w:val="000C44DE"/>
+    <w:rsid w:val="001B7507"/>
+    <w:rsid w:val="00294EB2"/>
     <w:rsid w:val="00310409"/>
+    <w:rsid w:val="004156F2"/>
+    <w:rsid w:val="005434F5"/>
+    <w:rsid w:val="006C5C20"/>
+    <w:rsid w:val="006D0B0C"/>
     <w:rsid w:val="0085066C"/>
+    <w:rsid w:val="00A66347"/>
     <w:rsid w:val="00B34401"/>
+    <w:rsid w:val="00B85FCF"/>
+    <w:rsid w:val="00C37C1A"/>
     <w:rsid w:val="00E236C1"/>
+    <w:rsid w:val="00F0689F"/>
+    <w:rsid w:val="00F751A4"/>
+    <w:rsid w:val="00FA5E15"/>
+    <w:rsid w:val="00FF5FE7"/>
   </w:rsids>
   <m:mathPr>
     <m:mathFont m:val="Cambria Math"/>
@@ -1978,10 +2004,17 @@
     <w:basedOn w:val="a0"/>
     <w:uiPriority w:val="99"/>
     <w:semiHidden/>
-    <w:rsid w:val="0085066C"/>
+    <w:rsid w:val="00F751A4"/>
     <w:rPr>
       <w:color w:val="666666"/>
     </w:rPr>
+  </w:style>
+  <w:style w:type="paragraph" w:customStyle="1" w:styleId="9AEF252382AB4116A2AA9BD2A09AE6A0">
+    <w:name w:val="9AEF252382AB4116A2AA9BD2A09AE6A0"/>
+    <w:rsid w:val="00F751A4"/>
+    <w:pPr>
+      <w:widowControl w:val="0"/>
+    </w:pPr>
   </w:style>
 </w:styles>
 </file>

</xml_diff>